<commit_message>
json case 6 pesticides
</commit_message>
<xml_diff>
--- a/Json file examples.docx
+++ b/Json file examples.docx
@@ -991,7 +991,7 @@
         <w:rPr>
           <w:lang w:val="en-GB"/>
         </w:rPr>
-        <w:t xml:space="preserve">piper1.py -q qdat.tsv -p pdat.tsv -hd hdat.tsv -v vdat_.tsv -cat </w:t>
+        <w:t xml:space="preserve">piper1.py -q qdat.tsv -p pdat.tsv -hd hdat.tsv -v vdat.tsv -cat </w:t>
       </w:r>
       <w:r>
         <w:rPr>
@@ -1029,6 +1029,259 @@
         </w:rPr>
         <w:t>case5</w:t>
       </w:r>
+    </w:p>
+    <w:p>
+      <w:pPr>
+        <w:rPr>
+          <w:lang w:val="en-GB"/>
+        </w:rPr>
+      </w:pPr>
+    </w:p>
+    <w:p>
+      <w:pPr>
+        <w:rPr>
+          <w:lang w:val="en-GB"/>
+        </w:rPr>
+      </w:pPr>
+    </w:p>
+    <w:p>
+      <w:pPr>
+        <w:rPr>
+          <w:lang w:val="en-GB"/>
+        </w:rPr>
+      </w:pPr>
+    </w:p>
+    <w:p>
+      <w:pPr>
+        <w:rPr>
+          <w:b/>
+          <w:bCs/>
+          <w:lang w:val="en-GB"/>
+        </w:rPr>
+      </w:pPr>
+      <w:r>
+        <w:rPr>
+          <w:b/>
+          <w:bCs/>
+          <w:lang w:val="en-GB"/>
+        </w:rPr>
+        <w:lastRenderedPageBreak/>
+        <w:t xml:space="preserve">Case </w:t>
+      </w:r>
+      <w:r>
+        <w:rPr>
+          <w:b/>
+          <w:bCs/>
+          <w:lang w:val="en-GB"/>
+        </w:rPr>
+        <w:t>6</w:t>
+      </w:r>
+    </w:p>
+    <w:p>
+      <w:pPr>
+        <w:rPr>
+          <w:lang w:val="en-GB"/>
+        </w:rPr>
+      </w:pPr>
+      <w:r>
+        <w:rPr>
+          <w:lang w:val="en-GB"/>
+        </w:rPr>
+        <w:t>cat_case</w:t>
+      </w:r>
+      <w:r>
+        <w:rPr>
+          <w:lang w:val="en-GB"/>
+        </w:rPr>
+        <w:t>6</w:t>
+      </w:r>
+      <w:r>
+        <w:rPr>
+          <w:lang w:val="en-GB"/>
+        </w:rPr>
+        <w:br/>
+        <w:t>cond_case</w:t>
+      </w:r>
+      <w:r>
+        <w:rPr>
+          <w:lang w:val="en-GB"/>
+        </w:rPr>
+        <w:t>6</w:t>
+      </w:r>
+    </w:p>
+    <w:p>
+      <w:pPr>
+        <w:rPr>
+          <w:lang w:val="en-GB"/>
+        </w:rPr>
+      </w:pPr>
+      <w:r>
+        <w:rPr>
+          <w:lang w:val="en-GB"/>
+        </w:rPr>
+        <w:t>Only patients that</w:t>
+      </w:r>
+      <w:r>
+        <w:rPr>
+          <w:lang w:val="en-GB"/>
+        </w:rPr>
+        <w:br/>
+        <w:t>- Have G20</w:t>
+      </w:r>
+      <w:r>
+        <w:rPr>
+          <w:lang w:val="en-GB"/>
+        </w:rPr>
+        <w:br/>
+        <w:t xml:space="preserve">- </w:t>
+      </w:r>
+      <w:r>
+        <w:rPr>
+          <w:lang w:val="en-GB"/>
+        </w:rPr>
+        <w:t>H</w:t>
+      </w:r>
+      <w:r>
+        <w:rPr>
+          <w:lang w:val="en-GB"/>
+        </w:rPr>
+        <w:t>ave Pesticide exposure</w:t>
+      </w:r>
+      <w:r>
+        <w:rPr>
+          <w:lang w:val="en-GB"/>
+        </w:rPr>
+        <w:t xml:space="preserve"> regularly (</w:t>
+      </w:r>
+      <w:r>
+        <w:rPr>
+          <w:lang w:val="en-GB"/>
+        </w:rPr>
+        <w:t>yes=</w:t>
+      </w:r>
+      <w:r>
+        <w:rPr>
+          <w:lang w:val="en-GB"/>
+        </w:rPr>
+        <w:t>1</w:t>
+      </w:r>
+      <w:r>
+        <w:rPr>
+          <w:lang w:val="en-GB"/>
+        </w:rPr>
+        <w:t xml:space="preserve"> or 2 !!!!!!!!!!!!!!!!!!????????????????????????</w:t>
+      </w:r>
+      <w:r>
+        <w:rPr>
+          <w:lang w:val="en-GB"/>
+        </w:rPr>
+        <w:t>)</w:t>
+      </w:r>
+    </w:p>
+    <w:p>
+      <w:pPr>
+        <w:rPr>
+          <w:lang w:val="en-GB"/>
+        </w:rPr>
+      </w:pPr>
+      <w:r>
+        <w:rPr>
+          <w:lang w:val="en-GB"/>
+        </w:rPr>
+        <w:t>Show diagnosis table</w:t>
+      </w:r>
+    </w:p>
+    <w:p>
+      <w:pPr>
+        <w:rPr>
+          <w:lang w:val="en-GB"/>
+        </w:rPr>
+      </w:pPr>
+      <w:r>
+        <w:rPr>
+          <w:lang w:val="en-GB"/>
+        </w:rPr>
+        <w:t xml:space="preserve">python </w:t>
+      </w:r>
+      <w:r>
+        <w:rPr>
+          <w:lang w:val="en-GB"/>
+        </w:rPr>
+        <w:t>program_scripts/</w:t>
+      </w:r>
+      <w:r>
+        <w:rPr>
+          <w:lang w:val="en-GB"/>
+        </w:rPr>
+        <w:t xml:space="preserve">piper1.py -q qdat.tsv -p pdat.tsv -hd hdat.tsv -v vdat.tsv -cat </w:t>
+      </w:r>
+      <w:r>
+        <w:rPr>
+          <w:lang w:val="en-GB"/>
+        </w:rPr>
+        <w:t>json_files/</w:t>
+      </w:r>
+      <w:r>
+        <w:rPr>
+          <w:lang w:val="en-GB"/>
+        </w:rPr>
+        <w:t>cat_case</w:t>
+      </w:r>
+      <w:r>
+        <w:rPr>
+          <w:lang w:val="en-GB"/>
+        </w:rPr>
+        <w:t>6</w:t>
+      </w:r>
+      <w:r>
+        <w:rPr>
+          <w:lang w:val="en-GB"/>
+        </w:rPr>
+        <w:t xml:space="preserve">.json -cond </w:t>
+      </w:r>
+      <w:r>
+        <w:rPr>
+          <w:lang w:val="en-GB"/>
+        </w:rPr>
+        <w:t>json_files/</w:t>
+      </w:r>
+      <w:r>
+        <w:rPr>
+          <w:lang w:val="en-GB"/>
+        </w:rPr>
+        <w:t>cond_case</w:t>
+      </w:r>
+      <w:r>
+        <w:rPr>
+          <w:lang w:val="en-GB"/>
+        </w:rPr>
+        <w:t>6</w:t>
+      </w:r>
+      <w:r>
+        <w:rPr>
+          <w:lang w:val="en-GB"/>
+        </w:rPr>
+        <w:t>.json -dt</w:t>
+      </w:r>
+      <w:r>
+        <w:rPr>
+          <w:lang w:val="en-GB"/>
+        </w:rPr>
+        <w:t xml:space="preserve"> -o case</w:t>
+      </w:r>
+      <w:r>
+        <w:rPr>
+          <w:lang w:val="en-GB"/>
+        </w:rPr>
+        <w:t>6</w:t>
+      </w:r>
+    </w:p>
+    <w:p>
+      <w:pPr>
+        <w:rPr>
+          <w:lang w:val="en-GB"/>
+        </w:rPr>
+      </w:pPr>
     </w:p>
     <w:p>
       <w:pPr>

</xml_diff>